<commit_message>
docs: enrich Word guide with explicit technology stacks, implementation code mechanics, and how parts work
</commit_message>
<xml_diff>
--- a/PROJECT_EVALUATION_TEAM_GUIDE.docx
+++ b/PROJECT_EVALUATION_TEAM_GUIDE.docx
@@ -11,25 +11,25 @@
         <w:rPr>
           <w:b/>
           <w:color w:val="123456"/>
-          <w:sz w:val="44"/>
+          <w:sz w:val="40"/>
         </w:rPr>
-        <w:t>PROJECT EVALUATION &amp; COMPREHENSIVE TEAM VIVA GUIDE</w:t>
+        <w:t>PROJECT EVALUATION &amp; TEAM VIVA GUIDE</w:t>
       </w:r>
     </w:p>
     <w:p>
       <w:pPr>
-        <w:spacing w:after="360"/>
+        <w:spacing w:after="320"/>
         <w:jc w:val="center"/>
       </w:pPr>
       <w:r>
         <w:rPr>
           <w:i/>
           <w:color w:val="646464"/>
-          <w:sz w:val="26"/>
+          <w:sz w:val="24"/>
         </w:rPr>
         <w:t>Helios &amp; Aeolus: AI &amp; Satellite Geospatial Decision Support System for Renewable Energy Siting</w:t>
         <w:br/>
-        <w:t>4-Member Work Breakdown, Full Project Mechanics, Code Walkthrough, and Viva Defense Strategy</w:t>
+        <w:t>Complete 4-Member Work Division, Exhaustive Technology Stack Mapping, Implementation Mechanics, Code Walkthrough &amp; Defense Strategy</w:t>
       </w:r>
     </w:p>
     <w:p>
@@ -42,7 +42,7 @@
           <w:b/>
           <w:color w:val="107C41"/>
         </w:rPr>
-        <w:t>Evaluation Readiness: 100% Complete | Tests: 78/78 Passing | Stack: Python FastAPI + Vanilla JS Leaflet</w:t>
+        <w:t>Evaluation Readiness: 100% Complete | Tests: 78/78 Passing | Stack: Python 3.14 + FastAPI + Leaflet GIS</w:t>
       </w:r>
     </w:p>
     <w:p>
@@ -59,31 +59,33 @@
         <w:rPr>
           <w:b/>
           <w:color w:val="123456"/>
-          <w:sz w:val="36"/>
+          <w:sz w:val="34"/>
         </w:rPr>
-        <w:t>Table of Contents &amp; Executive Roadmap</w:t>
+        <w:t>Table of Contents &amp; Preparation Blueprint</w:t>
       </w:r>
     </w:p>
     <w:p>
       <w:r>
-        <w:t>This master preparation guide is crafted for the upcoming project defense. It arms every team member with deep, unflinching command over their designated role and the entire interconnected system:</w:t>
+        <w:t>This master preparation guide is crafted for the upcoming project defense. It arms every team member with deep, unflinching command over their designated role, the exact technologies used, how each algorithm is implemented in code, and how all parts interconnect:</w:t>
         <w:br/>
         <w:br/>
-        <w:t>• Section 1: Executive 4-Member Work Division &amp; Delivery Matrix</w:t>
+        <w:t>• Section 1: Executive 4-Member Work Division &amp; Responsibility Matrix</w:t>
         <w:br/>
-        <w:t>• Section 2: End-to-End System Architecture (How All Parts Connect)</w:t>
+        <w:t>• Section 2: Complete Project Technology Stack &amp; Architecture Topology</w:t>
         <w:br/>
-        <w:t>• Section 3: Member 1 Deep Dive — Geospatial Data Pipeline, Satellite Weather &amp; Elevation</w:t>
+        <w:t>• Section 3: Member 1 Deep Dive — Technologies, Implementation Mechanics &amp; Algorithms (Data &amp; Topography)</w:t>
         <w:br/>
-        <w:t>• Section 4: Member 2 Deep Dive — Resource Scoring &amp; Physical Energy Conversion Physics</w:t>
+        <w:t>• Section 4: Member 2 Deep Dive — Technologies, Implementation Mechanics &amp; Algorithms (Physics &amp; Simulation)</w:t>
         <w:br/>
-        <w:t>• Section 5: Member 3 Deep Dive — Techno-Economics, Decision Engine &amp; Hardware Catalogs</w:t>
+        <w:t>• Section 5: Member 3 Deep Dive — Technologies, Implementation Mechanics &amp; Algorithms (Economics &amp; Hardware)</w:t>
         <w:br/>
-        <w:t>• Section 6: Member 4 Deep Dive — Interactive Frontend, Leaflet GIS &amp; Security Testing</w:t>
+        <w:t>• Section 6: Member 4 Deep Dive — Technologies, Implementation Mechanics &amp; Algorithms (GIS, REST API &amp; Security)</w:t>
         <w:br/>
-        <w:t>• Section 7: Complete Codebase &amp; Project Directory Architecture Breakdown</w:t>
+        <w:t>• Section 7: End-to-End Pipeline Mechanics: How Every Module Operates Independently &amp; Jointly</w:t>
         <w:br/>
-        <w:t>• Section 8: Professor Viva Defense Strategy — Likely Questions &amp; High-Scoring Answers</w:t>
+        <w:t>• Section 8: Complete Codebase &amp; Directory Inventory (Every File, Role &amp; Dependency)</w:t>
+        <w:br/>
+        <w:t>• Section 9: Professor Viva Defense Strategy — Top 10 Questions &amp; High-Scoring Answers</w:t>
         <w:br/>
       </w:r>
     </w:p>
@@ -96,7 +98,7 @@
         <w:rPr>
           <w:b/>
           <w:color w:val="123456"/>
-          <w:sz w:val="36"/>
+          <w:sz w:val="34"/>
         </w:rPr>
         <w:t>Section 1: 4-Member Work Division &amp; Responsibility Matrix</w:t>
       </w:r>
@@ -146,7 +148,7 @@
                 <w:b/>
                 <w:color w:val="FFFFFF"/>
               </w:rPr>
-              <w:t>Assigned Core Services</w:t>
+              <w:t>Assigned Services &amp; Files</w:t>
             </w:r>
           </w:p>
         </w:tc>
@@ -161,7 +163,7 @@
                 <w:b/>
                 <w:color w:val="FFFFFF"/>
               </w:rPr>
-              <w:t>Key Formulas &amp; Deliverables</w:t>
+              <w:t>Exact Technologies Used</w:t>
             </w:r>
           </w:p>
         </w:tc>
@@ -176,7 +178,7 @@
                 <w:b/>
                 <w:color w:val="FFFFFF"/>
               </w:rPr>
-              <w:t>Viva Role &amp; Focus</w:t>
+              <w:t>Viva Role &amp; Presentation Focus</w:t>
             </w:r>
           </w:p>
         </w:tc>
@@ -196,7 +198,7 @@
               </w:rPr>
               <w:t>Member 1</w:t>
               <w:br/>
-              <w:t>Data Engineer &amp; Geospatial Lead</w:t>
+              <w:t>Lead Geospatial Data Engineer</w:t>
             </w:r>
           </w:p>
         </w:tc>
@@ -209,11 +211,13 @@
               <w:spacing w:after="40"/>
             </w:pPr>
             <w:r>
-              <w:t>• weather_service.py</w:t>
+              <w:t>• backend/services/weather_service.py</w:t>
               <w:br/>
-              <w:t>• terrain_service.py</w:t>
+              <w:t>• backend/services/terrain_service.py</w:t>
               <w:br/>
-              <w:t>• validate_weather_data.py</w:t>
+              <w:t>• scripts/validate_weather_data.py</w:t>
+              <w:br/>
+              <w:t>• backend/data/*.csv</w:t>
             </w:r>
           </w:p>
         </w:tc>
@@ -226,13 +230,15 @@
               <w:spacing w:after="40"/>
             </w:pPr>
             <w:r>
-              <w:t>• Open-Meteo ERA5 / NASA POWER APIs</w:t>
+              <w:t>• Open-Meteo ERA5 Reanalysis API</w:t>
               <w:br/>
-              <w:t>• Digital Elevation Models &amp; Venturi speedup</w:t>
+              <w:t>• NASA POWER REST API</w:t>
               <w:br/>
-              <w:t>• Circular wind vector averaging (197.8° SSW)</w:t>
+              <w:t>• Open-Elevation SRTM API</w:t>
               <w:br/>
-              <w:t>• Data quality audit (0 duplicates/sentinels)</w:t>
+              <w:t>• Python requests, pandas, numpy</w:t>
+              <w:br/>
+              <w:t>• Vector trigonometric math</w:t>
             </w:r>
           </w:p>
         </w:tc>
@@ -245,7 +251,7 @@
               <w:spacing w:after="40"/>
             </w:pPr>
             <w:r>
-              <w:t>Explain how raw satellite solar/wind/terrain data is fetched, validated, and preprocessed for any coordinates on Earth.</w:t>
+              <w:t>Explain how raw satellite solar, wind, and elevation data are acquired for any coordinate on Earth, preprocessed without missing values, and validated for physical plausibility.</w:t>
             </w:r>
           </w:p>
         </w:tc>
@@ -265,7 +271,7 @@
               </w:rPr>
               <w:t>Member 2</w:t>
               <w:br/>
-              <w:t>Physics Modeler &amp; Energy Simulation Lead</w:t>
+              <w:t>Lead Renewable Energy Physicist</w:t>
             </w:r>
           </w:p>
         </w:tc>
@@ -278,11 +284,11 @@
               <w:spacing w:after="40"/>
             </w:pPr>
             <w:r>
-              <w:t>• resource_scoring.py</w:t>
+              <w:t>• backend/services/resource_scoring.py</w:t>
               <w:br/>
-              <w:t>• energy_model.py</w:t>
+              <w:t>• backend/services/energy_model.py</w:t>
               <w:br/>
-              <w:t>• rooftop_shadow_service.py</w:t>
+              <w:t>• backend/services/rooftop_shadow_service.py</w:t>
             </w:r>
           </w:p>
         </w:tc>
@@ -295,15 +301,15 @@
               <w:spacing w:after="40"/>
             </w:pPr>
             <w:r>
-              <w:t>• Solar (GHI, temp derating, consistency)</w:t>
+              <w:t>• NumPy vectorization</w:t>
               <w:br/>
-              <w:t>• Wind (hub extrapolation, WPD, shear factor)</w:t>
+              <w:t>• Astronomical solar positioning algorithms</w:t>
               <w:br/>
-              <w:t>• Solar PV yield (PR=0.78)</w:t>
+              <w:t>• Photovoltaic physics (PR=0.78)</w:t>
               <w:br/>
-              <w:t>• Cubic wind turbine power curve (v_cutin=3.0)</w:t>
+              <w:t>• Cubic aerodynamic power curve models</w:t>
               <w:br/>
-              <w:t>• Astronomical solar altitude/azimuth &amp; shadow</w:t>
+              <w:t>• Geometry &amp; trigonometry (tan/atan)</w:t>
             </w:r>
           </w:p>
         </w:tc>
@@ -316,7 +322,7 @@
               <w:spacing w:after="40"/>
             </w:pPr>
             <w:r>
-              <w:t>Explain how raw weather readings are converted into 0-100 resource scores, obstacle shadows, and physical monthly kWh generation.</w:t>
+              <w:t>Explain how weather data is converted into physical energy: scoring indices, obstacle shadows, optimal tilt/azimuth angles, and 12-month generation forecasts in kWh.</w:t>
             </w:r>
           </w:p>
         </w:tc>
@@ -336,7 +342,7 @@
               </w:rPr>
               <w:t>Member 3</w:t>
               <w:br/>
-              <w:t>Economics &amp; Systems Hardware Lead</w:t>
+              <w:t>Techno-Economics &amp; Hardware Lead</w:t>
             </w:r>
           </w:p>
         </w:tc>
@@ -349,13 +355,13 @@
               <w:spacing w:after="40"/>
             </w:pPr>
             <w:r>
-              <w:t>• economics_service.py</w:t>
+              <w:t>• backend/services/economics_service.py</w:t>
               <w:br/>
-              <w:t>• recommendation_engine.py</w:t>
+              <w:t>• backend/services/recommendation_engine.py</w:t>
               <w:br/>
-              <w:t>• wind_turbine_catalog.py</w:t>
+              <w:t>• backend/services/wind_turbine_catalog.py</w:t>
               <w:br/>
-              <w:t>• bess_service.py</w:t>
+              <w:t>• backend/services/bess_service.py</w:t>
             </w:r>
           </w:p>
         </w:tc>
@@ -368,15 +374,13 @@
               <w:spacing w:after="40"/>
             </w:pPr>
             <w:r>
-              <w:t>• 25-yr discounted cash flow (r=8%, 0.5% degradation)</w:t>
+              <w:t>• Discounted Cash Flow (DCF) modeling</w:t>
               <w:br/>
-              <w:t>• Simple Payback Period &amp; LCOE</w:t>
+              <w:t>• Multi-criteria decision trees</w:t>
               <w:br/>
-              <w:t>• Multi-criteria decision tree</w:t>
+              <w:t>• Python dictionary catalogs &amp; structural safety constraints</w:t>
               <w:br/>
-              <w:t>• Hardware specs: 4 turbines (VAWT/HAWT)</w:t>
-              <w:br/>
-              <w:t>• LiFePO4 BESS sizing (8h night autonomy)</w:t>
+              <w:t>• Electrochemical battery modeling (LiFePO4)</w:t>
             </w:r>
           </w:p>
         </w:tc>
@@ -389,7 +393,7 @@
               <w:spacing w:after="40"/>
             </w:pPr>
             <w:r>
-              <w:t>Explain how physical energy yields are turned into financial viability (CAPEX, Payback, NPV), concrete equipment catalogs, and final verdicts.</w:t>
+              <w:t>Explain how physical energy yield is turned into financial viability (CAPEX, Payback, NPV), how commercial hardware is matched to site categories, and how the multi-criteria verdict is generated.</w:t>
             </w:r>
           </w:p>
         </w:tc>
@@ -409,7 +413,7 @@
               </w:rPr>
               <w:t>Member 4</w:t>
               <w:br/>
-              <w:t>Full-Stack Integrator &amp; QA/Security Lead</w:t>
+              <w:t>Full-Stack Integrator &amp; Security QA Lead</w:t>
             </w:r>
           </w:p>
         </w:tc>
@@ -426,9 +430,9 @@
               <w:br/>
               <w:t>• index.html</w:t>
               <w:br/>
-              <w:t>• rooftop_image_service.py</w:t>
+              <w:t>• backend/services/rooftop_image_service.py</w:t>
               <w:br/>
-              <w:t>• regional_scanner.py</w:t>
+              <w:t>• backend/services/regional_scanner.py</w:t>
               <w:br/>
               <w:t>• tests/test_api.py</w:t>
             </w:r>
@@ -443,15 +447,15 @@
               <w:spacing w:after="40"/>
             </w:pPr>
             <w:r>
-              <w:t>• FastAPI REST pipeline &amp; CORS configuration</w:t>
+              <w:t>• FastAPI &amp; Pydantic v2</w:t>
               <w:br/>
-              <w:t>• Leaflet GIS multi-layer map with smooth zoom</w:t>
+              <w:t>• Leaflet.js GIS, OpenStreetMap, ESRI Satellite, OpenTopoMap</w:t>
               <w:br/>
-              <w:t>• Computer vision texture &amp; EXIF extraction</w:t>
+              <w:t>• Chart.js &amp; SVG vector graphics</w:t>
               <w:br/>
-              <w:t>• Regional raster heatmap scanner</w:t>
+              <w:t>• Pillow (PIL) &amp; piexif for EXIF metadata</w:t>
               <w:br/>
-              <w:t>• Pytest 78-test suite (OWASP Top 10, Bandit)</w:t>
+              <w:t>• Pytest, Bandit, pip-audit, Semgrep</w:t>
             </w:r>
           </w:p>
         </w:tc>
@@ -464,7 +468,7 @@
               <w:spacing w:after="40"/>
             </w:pPr>
             <w:r>
-              <w:t>Explain how the user interacts with the system, how frontend talks to backend, image EXIF GPS extraction, and how the app was tested.</w:t>
+              <w:t>Explain how the user interacts with the system, how frontend and backend communicate via REST, how drone photos auto-navigate the map, and how the entire system was rigorously tested.</w:t>
             </w:r>
           </w:p>
         </w:tc>
@@ -484,95 +488,490 @@
         <w:rPr>
           <w:b/>
           <w:color w:val="123456"/>
-          <w:sz w:val="36"/>
+          <w:sz w:val="34"/>
         </w:rPr>
-        <w:t>Section 2: End-to-End System Pipeline (How the Whole Project Works)</w:t>
+        <w:t>Section 2: Complete Project Technology Stack &amp; Architecture Topology</w:t>
       </w:r>
     </w:p>
     <w:p>
       <w:r>
-        <w:t>To convince the professor, the team must demonstrate how each service operates independently as a modular Python engine, and how they link together sequentially inside `backend/main.py` when a user clicks 'Run Renewable Optimization' on the map.</w:t>
+        <w:t>The project is built on modern, lightweight, industry-standard technologies that require no costly cloud infrastructure or proprietary licenses. Every tier is designed for rapid execution and reproducible evaluation:</w:t>
+      </w:r>
+    </w:p>
+    <w:tbl>
+      <w:tblPr>
+        <w:tblStyle w:val="TableGrid"/>
+        <w:tblW w:type="auto" w:w="0"/>
+        <w:jc w:val="center"/>
+        <w:tblLook w:firstColumn="1" w:firstRow="1" w:lastColumn="0" w:lastRow="0" w:noHBand="0" w:noVBand="1" w:val="04A0"/>
+      </w:tblPr>
+      <w:tblGrid>
+        <w:gridCol w:w="3120"/>
+        <w:gridCol w:w="3120"/>
+        <w:gridCol w:w="3120"/>
+      </w:tblGrid>
+      <w:tr>
+        <w:tc>
+          <w:tcPr>
+            <w:tcW w:type="dxa" w:w="3120"/>
+            <w:shd w:val="clear" w:color="auto" w:fill="123456"/>
+          </w:tcPr>
+          <w:p>
+            <w:r>
+              <w:rPr>
+                <w:b/>
+                <w:color w:val="FFFFFF"/>
+              </w:rPr>
+              <w:t>Architecture Tier</w:t>
+            </w:r>
+          </w:p>
+        </w:tc>
+        <w:tc>
+          <w:tcPr>
+            <w:tcW w:type="dxa" w:w="3120"/>
+            <w:shd w:val="clear" w:color="auto" w:fill="123456"/>
+          </w:tcPr>
+          <w:p>
+            <w:r>
+              <w:rPr>
+                <w:b/>
+                <w:color w:val="FFFFFF"/>
+              </w:rPr>
+              <w:t>Technologies, Frameworks &amp; Libraries</w:t>
+            </w:r>
+          </w:p>
+        </w:tc>
+        <w:tc>
+          <w:tcPr>
+            <w:tcW w:type="dxa" w:w="3120"/>
+            <w:shd w:val="clear" w:color="auto" w:fill="123456"/>
+          </w:tcPr>
+          <w:p>
+            <w:r>
+              <w:rPr>
+                <w:b/>
+                <w:color w:val="FFFFFF"/>
+              </w:rPr>
+              <w:t>Role &amp; Operational Purpose</w:t>
+            </w:r>
+          </w:p>
+        </w:tc>
+      </w:tr>
+      <w:tr>
+        <w:tc>
+          <w:tcPr>
+            <w:tcW w:type="dxa" w:w="3120"/>
+          </w:tcPr>
+          <w:p>
+            <w:pPr>
+              <w:spacing w:after="40"/>
+            </w:pPr>
+            <w:r>
+              <w:rPr>
+                <w:b/>
+              </w:rPr>
+              <w:t>Frontend Client Tier</w:t>
+            </w:r>
+          </w:p>
+        </w:tc>
+        <w:tc>
+          <w:tcPr>
+            <w:tcW w:type="dxa" w:w="3120"/>
+          </w:tcPr>
+          <w:p>
+            <w:pPr>
+              <w:spacing w:after="40"/>
+            </w:pPr>
+            <w:r>
+              <w:t>• HTML5 / CSS3 (Hallmark minimalist sage-slate theme)</w:t>
+              <w:br/>
+              <w:t>• Vanilla JavaScript (ES6+, async/await, fetch API)</w:t>
+              <w:br/>
+              <w:t>• Leaflet.js 1.9.4 (Interactive Slippy Map)</w:t>
+              <w:br/>
+              <w:t>• Chart.js 4.4 (Semicircle gauge &amp; bar charts)</w:t>
+              <w:br/>
+              <w:t>• Scalable Vector Graphics (SVG 1.1)</w:t>
+            </w:r>
+          </w:p>
+        </w:tc>
+        <w:tc>
+          <w:tcPr>
+            <w:tcW w:type="dxa" w:w="3120"/>
+          </w:tcPr>
+          <w:p>
+            <w:pPr>
+              <w:spacing w:after="40"/>
+            </w:pPr>
+            <w:r>
+              <w:t>Renders the interactive map, controls parameter pills, executes zero-reload asynchronous REST calls, draws generation charts, and updates dynamic SVG artwork without frontend build toolchain overhead.</w:t>
+            </w:r>
+          </w:p>
+        </w:tc>
+      </w:tr>
+      <w:tr>
+        <w:tc>
+          <w:tcPr>
+            <w:tcW w:type="dxa" w:w="3120"/>
+          </w:tcPr>
+          <w:p>
+            <w:pPr>
+              <w:spacing w:after="40"/>
+            </w:pPr>
+            <w:r>
+              <w:rPr>
+                <w:b/>
+              </w:rPr>
+              <w:t>Backend Web API Tier</w:t>
+            </w:r>
+          </w:p>
+        </w:tc>
+        <w:tc>
+          <w:tcPr>
+            <w:tcW w:type="dxa" w:w="3120"/>
+          </w:tcPr>
+          <w:p>
+            <w:pPr>
+              <w:spacing w:after="40"/>
+            </w:pPr>
+            <w:r>
+              <w:t>• Python 3.14.3</w:t>
+              <w:br/>
+              <w:t>• FastAPI 0.143.0 (ASGI high-performance web framework)</w:t>
+              <w:br/>
+              <w:t>• Starlette &amp; Uvicorn 0.54.0 (ASGI server)</w:t>
+              <w:br/>
+              <w:t>• Pydantic v2 (Declarative request validation)</w:t>
+              <w:br/>
+              <w:t>• Python threading.Lock (Concurrency safety)</w:t>
+            </w:r>
+          </w:p>
+        </w:tc>
+        <w:tc>
+          <w:tcPr>
+            <w:tcW w:type="dxa" w:w="3120"/>
+          </w:tcPr>
+          <w:p>
+            <w:pPr>
+              <w:spacing w:after="40"/>
+            </w:pPr>
+            <w:r>
+              <w:t>Validates incoming client parameters, routes HTTP requests, enforces CORS policies, coordinates micro-services sequentially, and serializes JSON envelopes.</w:t>
+            </w:r>
+          </w:p>
+        </w:tc>
+      </w:tr>
+      <w:tr>
+        <w:tc>
+          <w:tcPr>
+            <w:tcW w:type="dxa" w:w="3120"/>
+          </w:tcPr>
+          <w:p>
+            <w:pPr>
+              <w:spacing w:after="40"/>
+            </w:pPr>
+            <w:r>
+              <w:rPr>
+                <w:b/>
+              </w:rPr>
+              <w:t>Data &amp; Numerical Tier</w:t>
+            </w:r>
+          </w:p>
+        </w:tc>
+        <w:tc>
+          <w:tcPr>
+            <w:tcW w:type="dxa" w:w="3120"/>
+          </w:tcPr>
+          <w:p>
+            <w:pPr>
+              <w:spacing w:after="40"/>
+            </w:pPr>
+            <w:r>
+              <w:t>• Pandas 3.0.6 (DataFrames, resampling, time-series)</w:t>
+              <w:br/>
+              <w:t>• NumPy 2.5.4 (Vectorized arrays, L2 Ridge regression)</w:t>
+              <w:br/>
+              <w:t>• Python math module (Trigonometric functions)</w:t>
+              <w:br/>
+              <w:t>• File-based datastore (CSV &amp; JSON format)</w:t>
+            </w:r>
+          </w:p>
+        </w:tc>
+        <w:tc>
+          <w:tcPr>
+            <w:tcW w:type="dxa" w:w="3120"/>
+          </w:tcPr>
+          <w:p>
+            <w:pPr>
+              <w:spacing w:after="40"/>
+            </w:pPr>
+            <w:r>
+              <w:t>Performs high-speed tabular processing, data aggregation, 8,760-hour array computations, circular wind vector averaging, and serialization of simulation states.</w:t>
+            </w:r>
+          </w:p>
+        </w:tc>
+      </w:tr>
+      <w:tr>
+        <w:tc>
+          <w:tcPr>
+            <w:tcW w:type="dxa" w:w="3120"/>
+          </w:tcPr>
+          <w:p>
+            <w:pPr>
+              <w:spacing w:after="40"/>
+            </w:pPr>
+            <w:r>
+              <w:rPr>
+                <w:b/>
+              </w:rPr>
+              <w:t>Computer Vision &amp; Drone Vision Tier</w:t>
+            </w:r>
+          </w:p>
+        </w:tc>
+        <w:tc>
+          <w:tcPr>
+            <w:tcW w:type="dxa" w:w="3120"/>
+          </w:tcPr>
+          <w:p>
+            <w:pPr>
+              <w:spacing w:after="40"/>
+            </w:pPr>
+            <w:r>
+              <w:t>• Pillow (PIL) 13.0.0 (Image processing)</w:t>
+              <w:br/>
+              <w:t>• piexif 1.1.3 (EXIF metadata parsing)</w:t>
+            </w:r>
+          </w:p>
+        </w:tc>
+        <w:tc>
+          <w:tcPr>
+            <w:tcW w:type="dxa" w:w="3120"/>
+          </w:tcPr>
+          <w:p>
+            <w:pPr>
+              <w:spacing w:after="40"/>
+            </w:pPr>
+            <w:r>
+              <w:t>Parses uploaded rooftop/drone images, extracts embedded GPS coordinate headers (lat/lon), and performs texture edge-density and entropy scoring to estimate roof obstacle coverage.</w:t>
+            </w:r>
+          </w:p>
+        </w:tc>
+      </w:tr>
+      <w:tr>
+        <w:tc>
+          <w:tcPr>
+            <w:tcW w:type="dxa" w:w="3120"/>
+          </w:tcPr>
+          <w:p>
+            <w:pPr>
+              <w:spacing w:after="40"/>
+            </w:pPr>
+            <w:r>
+              <w:rPr>
+                <w:b/>
+              </w:rPr>
+              <w:t>Geospatial &amp; Climate APIs</w:t>
+            </w:r>
+          </w:p>
+        </w:tc>
+        <w:tc>
+          <w:tcPr>
+            <w:tcW w:type="dxa" w:w="3120"/>
+          </w:tcPr>
+          <w:p>
+            <w:pPr>
+              <w:spacing w:after="40"/>
+            </w:pPr>
+            <w:r>
+              <w:t>• Open-Meteo ERA5 / Copernicus Global Reanalysis API</w:t>
+              <w:br/>
+              <w:t>• NASA POWER API (NASA Langley Research Center)</w:t>
+              <w:br/>
+              <w:t>• Open-Elevation API (Shuttle Radar Topography Mission)</w:t>
+              <w:br/>
+              <w:t>• OpenStreetMap, ESRI Satellite, OpenTopoMap</w:t>
+            </w:r>
+          </w:p>
+        </w:tc>
+        <w:tc>
+          <w:tcPr>
+            <w:tcW w:type="dxa" w:w="3120"/>
+          </w:tcPr>
+          <w:p>
+            <w:pPr>
+              <w:spacing w:after="40"/>
+            </w:pPr>
+            <w:r>
+              <w:t>Provides global climate and digital elevation observations without manual hardware deployment, powering site analysis for any coordinate on Earth.</w:t>
+            </w:r>
+          </w:p>
+        </w:tc>
+      </w:tr>
+      <w:tr>
+        <w:tc>
+          <w:tcPr>
+            <w:tcW w:type="dxa" w:w="3120"/>
+          </w:tcPr>
+          <w:p>
+            <w:pPr>
+              <w:spacing w:after="40"/>
+            </w:pPr>
+            <w:r>
+              <w:rPr>
+                <w:b/>
+              </w:rPr>
+              <w:t>Testing &amp; Quality Assurance Tier</w:t>
+            </w:r>
+          </w:p>
+        </w:tc>
+        <w:tc>
+          <w:tcPr>
+            <w:tcW w:type="dxa" w:w="3120"/>
+          </w:tcPr>
+          <w:p>
+            <w:pPr>
+              <w:spacing w:after="40"/>
+            </w:pPr>
+            <w:r>
+              <w:t>• Pytest 9.2.0 (Automated test runner)</w:t>
+              <w:br/>
+              <w:t>• HTTPX 0.28.1 (Asynchronous HTTP client for testing)</w:t>
+              <w:br/>
+              <w:t>• Bandit 1.9.4 (AST security linter)</w:t>
+              <w:br/>
+              <w:t>• pip-audit 2.10.1 (CVE vulnerability audit)</w:t>
+              <w:br/>
+              <w:t>• Semgrep 1.182.1 (Static code analysis rule engine)</w:t>
+            </w:r>
+          </w:p>
+        </w:tc>
+        <w:tc>
+          <w:tcPr>
+            <w:tcW w:type="dxa" w:w="3120"/>
+          </w:tcPr>
+          <w:p>
+            <w:pPr>
+              <w:spacing w:after="40"/>
+            </w:pPr>
+            <w:r>
+              <w:t>Guarantees software correctness, verifying 78 automated test cases, OWASP Top 10 security standards, input sanitization, and dependency safety.</w:t>
+            </w:r>
+          </w:p>
+        </w:tc>
+      </w:tr>
+    </w:tbl>
+    <w:p>
+      <w:r>
+        <w:br w:type="page"/>
+      </w:r>
+    </w:p>
+    <w:p>
+      <w:pPr>
+        <w:pStyle w:val="Heading1"/>
+        <w:spacing w:before="280" w:after="120"/>
+      </w:pPr>
+      <w:r>
+        <w:rPr>
+          <w:b/>
+          <w:color w:val="123456"/>
+          <w:sz w:val="34"/>
+        </w:rPr>
+        <w:t>Section 3: Member 1 — Data Engineering, Satellite Weather &amp; Topography</w:t>
       </w:r>
     </w:p>
     <w:p>
       <w:r>
-        <w:t>Step-by-Step Execution Chain inside `POST /api/analyze-site`:</w:t>
+        <w:t>Lead Geospatial Data Engineer | Focus: Satellite Acquisition, Data Cleaning, Trigonometric Vector Averaging &amp; Topography</w:t>
+        <w:br/>
+        <w:t>Files: `backend/services/weather_service.py`, `backend/services/terrain_service.py`, `scripts/validate_weather_data.py`</w:t>
+      </w:r>
+    </w:p>
+    <w:p>
+      <w:pPr>
+        <w:pStyle w:val="Heading2"/>
+        <w:spacing w:before="280" w:after="120"/>
+      </w:pPr>
+      <w:r>
+        <w:rPr>
+          <w:b/>
+          <w:color w:val="107C41"/>
+          <w:sz w:val="26"/>
+        </w:rPr>
+        <w:t>1. Technologies Used &amp; Why:</w:t>
+      </w:r>
+    </w:p>
+    <w:p>
+      <w:r>
+        <w:t>• Python requests: Handles HTTP GET requests with custom timeouts, error handling, and parameter encoding.</w:t>
+        <w:br/>
+        <w:t>• Pandas (pd.DataFrame, pd.date_range, resample): Time-series indexing, date parsing, and monthly aggregations.</w:t>
+        <w:br/>
+        <w:t>• NumPy (np.sin, np.cos, np.arctan2, np.deg2rad): Vectorized circular trigonometry for wind direction.</w:t>
+        <w:br/>
+        <w:t>• Open-Meteo ERA5 Reanalysis API: Primary high-speed satellite weather fetcher (responds in &lt;1s with 100% data coverage).</w:t>
+        <w:br/>
+        <w:t>• NASA POWER API: Secondary fallback weather source.</w:t>
+        <w:br/>
+        <w:t>• Open-Elevation API: Samples global digital elevation data derived from the SRTM satellite mission.</w:t>
+      </w:r>
+    </w:p>
+    <w:p>
+      <w:pPr>
+        <w:pStyle w:val="Heading2"/>
+        <w:spacing w:before="280" w:after="120"/>
+      </w:pPr>
+      <w:r>
+        <w:rPr>
+          <w:b/>
+          <w:color w:val="107C41"/>
+          <w:sz w:val="26"/>
+        </w:rPr>
+        <w:t>2. How It Is Implemented in Code:</w:t>
+      </w:r>
+    </w:p>
+    <w:p>
+      <w:r>
+        <w:t>A. High-Speed Satellite Fetcher (`backend/services/weather_service.py`):</w:t>
+        <w:br/>
+        <w:t xml:space="preserve">   • The function `fetch_weather_for_location(latitude, longitude)` dynamically computes the 1-year date range ending 5 days prior to today: `start_date = end_date - timedelta(days=364)`.</w:t>
+        <w:br/>
+        <w:t xml:space="preserve">   • Queries Open-Meteo's `/v1/archive` endpoint with `daily=shortwave_radiation_sum,temperature_2m_mean` and `hourly=wind_speed_10m,wind_direction_10m`.</w:t>
+        <w:br/>
+        <w:t xml:space="preserve">   • Radiation Unit Conversion: Open-Meteo returns shortwave radiation in $MJ/m^2/day$. The implementation converts this directly to electrical engineering units: `solar_kwh = (solar_mj / 3.6).clip(lower=0.0)` ($1\ kWh = 3.6\ MJ$).</w:t>
+        <w:br/>
+        <w:t xml:space="preserve">   • Resampling &amp; Monthly Aggregation: `build_monthly_summary()` uses `daily_df.resample('MS')` and `hourly_df.resample('MS')` to calculate valid observation counts, coverage percentages, median wind speed, and 90th percentile wind speed (`quantile(0.90)`).</w:t>
+        <w:br/>
+        <w:t xml:space="preserve">   • Automatic Fallback: If Open-Meteo raises an exception or times out, the code catches it inside a `try/except` block and automatically invokes `fetch_nasa_data(latitude, longitude)`.</w:t>
         <w:br/>
         <w:br/>
-        <w:t>1. USER INPUT: The user clicks the Leaflet map or inputs coordinates (lat, lon), plot area (m²), monthly electricity bill/load (kWh), tariff (INR/kWh), site category (e.g. residential rooftop, farmland), desired BESS battery backup hours, and adjacent obstacle dimensions.</w:t>
+        <w:t>B. Circular Wind Direction Averaging (`scripts/validate_weather_data.py` &amp; `weather_service.py`):</w:t>
+        <w:br/>
+        <w:t xml:space="preserve">   • Why it's needed: Arithmetic averaging fails because $359^\circ$ and $1^\circ$ average to $180^\circ$ (South) instead of $0^\circ$ (North).</w:t>
+        <w:br/>
+        <w:t xml:space="preserve">   • Code Implementation:</w:t>
+        <w:br/>
+        <w:t xml:space="preserve">     `rad = np.deg2rad(valid_numeric.values)`</w:t>
+        <w:br/>
+        <w:t xml:space="preserve">     `sin_mean = np.mean(np.sin(rad))`</w:t>
+        <w:br/>
+        <w:t xml:space="preserve">     `cos_mean = np.mean(np.cos(rad))`</w:t>
+        <w:br/>
+        <w:t xml:space="preserve">     `circular_mean_deg = np.rad2deg(np.arctan2(sin_mean, cos_mean)) % 360`</w:t>
+        <w:br/>
+        <w:t xml:space="preserve">   • Evaluated on our 8,760 hourly readings, this proved a prevailing wind vector of $197.82^\circ$ (South-Southwest), matching monsoonal circulation.</w:t>
         <w:br/>
         <w:br/>
-        <w:t>2. TOPOGRAPHY ANALYSIS (`terrain_service.py` - Member 1):</w:t>
+        <w:t>C. Topographic Slope &amp; Venturi Wind Speedup (`backend/services/terrain_service.py`):</w:t>
         <w:br/>
-        <w:t xml:space="preserve">   • Queries Open-Elevation SRTM API at (lat, lon) and two 1.1km offset coordinates (North, East).</w:t>
+        <w:t xml:space="preserve">   • Samples 3 points via Open-Elevation API: `(lat, lon)`, `(lat+0.01, lon)`, and `(lat, lon+0.01)` (offset by ~1.1 km).</w:t>
         <w:br/>
-        <w:t xml:space="preserve">   • Calculates topographic gradient: s = sqrt(d_north² + d_east²) and slope angle.</w:t>
+        <w:t xml:space="preserve">   • Elevation gradients: `d_north = (north_elev - center_elev) / 1110.0` and `d_east = (east_elev - center_elev) / 1110.0`.</w:t>
         <w:br/>
-        <w:t xml:space="preserve">   • Evaluates Venturi ridge speed-up factor S = 1.0 + min(0.35, s * 2.5). Wind accelerates over ridges.</w:t>
+        <w:t xml:space="preserve">   • Slope gradient: `s = math.sqrt(d_north**2 + d_east**2)`, converted to degrees: `slope_deg = math.degrees(math.atan(s))`.</w:t>
         <w:br/>
-        <w:br/>
-        <w:t>3. SATELLITE CLIMATE INGESTION (`weather_service.py` - Member 1):</w:t>
-        <w:br/>
-        <w:t xml:space="preserve">   • Queries Open-Meteo ERA5 / Copernicus Reanalysis for 365 daily GHI insolation values and 8,760 hourly wind speeds/directions.</w:t>
-        <w:br/>
-        <w:t xml:space="preserve">   • Automatic fallback to NASA POWER API.</w:t>
-        <w:br/>
-        <w:t xml:space="preserve">   • Builds `monthly_summary.csv`, calculating data coverage percentages and circular wind vector averages.</w:t>
-        <w:br/>
-        <w:br/>
-        <w:t>4. RESOURCE SUITABILITY SCORING (`resource_scoring.py` - Member 2):</w:t>
-        <w:br/>
-        <w:t xml:space="preserve">   • Computes 0-100 Solar Suitability Score: Baseline GHI (up to 70 pts) - Ambient Temperature Derating (15 pts) + Seasonal Consistency Ratio (15 pts).</w:t>
-        <w:br/>
-        <w:t xml:space="preserve">   • Computes 0-100 Wind Suitability Score: Hub-height extrapolated wind speed (50 pts) + Cut-in availability hours (30 pts) + Wind Power Density (20 pts).</w:t>
-        <w:br/>
-        <w:br/>
-        <w:t>5. ROOFTOP SHADOW &amp; MICRO-PLACEMENT (`rooftop_shadow_service.py` - Member 2):</w:t>
-        <w:br/>
-        <w:t xml:space="preserve">   • Evaluates astronomical solar declination, altitude, and azimuth at critical winter solstice (lowest solar elevation).</w:t>
-        <w:br/>
-        <w:t xml:space="preserve">   • Calculates adjacent building shadow length: L = Height / tan(solar_altitude) and plot penetration.</w:t>
-        <w:br/>
-        <w:t xml:space="preserve">   • Determines optimal panel tilt (lat ± 5°) and True South azimuth (180°).</w:t>
-        <w:br/>
-        <w:t xml:space="preserve">   • Deducts shaded boundary area, outputting effective unshaded solar area (m²).</w:t>
-        <w:br/>
-        <w:br/>
-        <w:t>6. PHYSICAL ENERGY SIMULATION (`energy_model.py` - Member 2):</w:t>
-        <w:br/>
-        <w:t xml:space="preserve">   • Solar PV: Sized to roof area (area / 7 m²/kW). Monthly yield = Capacity * GHI * Days * PR (PR = 0.78).</w:t>
-        <w:br/>
-        <w:t xml:space="preserve">   • Wind Turbine: Evaluates continuous cubic power curve on all 8,760 hourly hub-height speeds.</w:t>
-        <w:br/>
-        <w:t xml:space="preserve">   • Computes annual solar kWh, annual wind kWh, and load offset percentages.</w:t>
-        <w:br/>
-        <w:br/>
-        <w:t>7. TECHNO-ECONOMIC FEASIBILITY (`economics_service.py` - Member 3):</w:t>
-        <w:br/>
-        <w:t xml:space="preserve">   • Establishes CAPEX (Solar: ₹50,000/kW, Wind: ₹95,000/kW) and annual OPEX.</w:t>
-        <w:br/>
-        <w:t xml:space="preserve">   • Net metering: Self-consumed energy saves 100% tariff; surplus grid export earns 50% tariff.</w:t>
-        <w:br/>
-        <w:t xml:space="preserve">   • Evaluates 25-year discounted cash flow at 8% discount rate with 0.5%/yr PV degradation. Outputs NPV, Payback Period, and LCOE.</w:t>
-        <w:br/>
-        <w:br/>
-        <w:t>8. HARDWARE SELECTION &amp; BESS SIZING (`wind_turbine_catalog.py` &amp; `bess_service.py` - Member 3):</w:t>
-        <w:br/>
-        <w:t xml:space="preserve">   • Matches site category to specific commercial turbine (e.g., silent VAWT for residential, high-efficiency HAWT for farms).</w:t>
-        <w:br/>
-        <w:t xml:space="preserve">   • Sizes LiFePO4 battery storage for desired backup hours accounting for 85% DoD and 92% round-trip efficiency.</w:t>
-        <w:br/>
-        <w:br/>
-        <w:t>9. MULTI-CRITERIA DECISION TREE (`recommendation_engine.py` - Member 3):</w:t>
-        <w:br/>
-        <w:t xml:space="preserve">   • Evaluates suitability scores, payback periods, physical feasibility, and terrain to issue the authoritative verdict: 'Rooftop / Ground Solar PV', 'Wind Turbine System', or 'Solar-Wind Hybrid System', complete with natural language explanation.</w:t>
-        <w:br/>
-        <w:br/>
-        <w:t>10. REST API RESPONSE &amp; REACTIVE UI (`backend/main.py` &amp; `index.html` - Member 4):</w:t>
-        <w:br/>
-        <w:t xml:space="preserve">   • FastAPI serializes comprehensive JSON envelope with totalized turnkey CAPEX.</w:t>
-        <w:br/>
-        <w:t xml:space="preserve">   • Frontend updates without page reload: Siting Index semicircle gauge, 12-month generation forecast bar chart, shadow micro-placement zoning, turbine spec sheet, BESS autonomy, and dynamic SVG vector landscape art.</w:t>
+        <w:t xml:space="preserve">   • Aerodynamic Ridge Speed-up: On elevated ground (&gt;600m), terrain accelerates boundary-layer wind via the Venturi effect: `wind_terrain_speedup = round(1.0 + min(0.35, s * 2.5), 2)`, applying up to a $1.35</w:t>
+        <w:tab/>
+        <w:t>imes$ multiplier.</w:t>
       </w:r>
     </w:p>
     <w:p>
@@ -589,18 +988,16 @@
         <w:rPr>
           <w:b/>
           <w:color w:val="123456"/>
-          <w:sz w:val="36"/>
+          <w:sz w:val="34"/>
         </w:rPr>
-        <w:t>Section 3: Member 1 — Data Engineering, Satellite Weather &amp; Topography</w:t>
+        <w:t>Section 4: Member 2 — Resource Scoring, Shadow Modeling &amp; Energy Physics</w:t>
       </w:r>
     </w:p>
     <w:p>
       <w:r>
-        <w:t>Title: Lead Geospatial Data Engineer</w:t>
+        <w:t>Lead Renewable Energy Physicist | Focus: Suitability Formulas, Astronomical Solar Position, Shadow Geometry &amp; Physical Simulations</w:t>
         <w:br/>
-        <w:t>Files Owned: backend/services/weather_service.py, backend/services/terrain_service.py, scripts/validate_weather_data.py</w:t>
-        <w:br/>
-        <w:t>Datasets Owned: backend/data/daily_weather.csv, backend/data/hourly_wind.csv, backend/data/monthly_summary.csv</w:t>
+        <w:t>Files: `backend/services/resource_scoring.py`, `backend/services/energy_model.py`, `backend/services/rooftop_shadow_service.py`</w:t>
       </w:r>
     </w:p>
     <w:p>
@@ -612,47 +1009,85 @@
         <w:rPr>
           <w:b/>
           <w:color w:val="107C41"/>
-          <w:sz w:val="28"/>
+          <w:sz w:val="26"/>
         </w:rPr>
-        <w:t>What Member 1 Must Explain From Start to Finish:</w:t>
+        <w:t>1. Technologies Used &amp; Why:</w:t>
       </w:r>
     </w:p>
     <w:p>
       <w:r>
-        <w:t>1. THE SATELLITE WEATHER PROBLEM &amp; SOLUTION:</w:t>
+        <w:t>• NumPy: High-speed vectorized computations across 8,760 hourly wind data points without slow Python for-loops.</w:t>
         <w:br/>
-        <w:t xml:space="preserve">   • Problem: NASA POWER's daily endpoint originally had 18.36% missing solar records in late season and 100% missing daily wind direction (WD10M).</w:t>
+        <w:t>• Python math module: Precision trigonometric functions (`math.sin`, `math.cos`, `math.tan`, `math.radians`, `math.asin`, `math.acos`).</w:t>
         <w:br/>
-        <w:t xml:space="preserve">   • Solution: Implemented a dual-source satellite pipeline in `weather_service.py`. The primary engine queries Open-Meteo ERA5 / Copernicus Reanalysis, retrieving 365 daily shortwave solar radiation observations (converted from MJ/m² to kWh/m² by dividing by 3.6) and 8,760 consecutive hourly wind speeds and directions in seconds. NASA POWER is maintained as an automated fallback.</w:t>
+        <w:t>• Solar Astronomical Equations: Rigorous solar altitude and azimuth positioning algorithms.</w:t>
+        <w:br/>
+        <w:t>• Photovoltaic Engineering Models: Standard IEC 61724 PV performance ratio ($PR = 0.78$).</w:t>
+        <w:br/>
+        <w:t>• Wind Turbine Aerodynamics: Continuous cubic power curve interpolation.</w:t>
+      </w:r>
+    </w:p>
+    <w:p>
+      <w:pPr>
+        <w:pStyle w:val="Heading2"/>
+        <w:spacing w:before="280" w:after="120"/>
+      </w:pPr>
+      <w:r>
+        <w:rPr>
+          <w:b/>
+          <w:color w:val="107C41"/>
+          <w:sz w:val="26"/>
+        </w:rPr>
+        <w:t>2. How It Is Implemented in Code:</w:t>
+      </w:r>
+    </w:p>
+    <w:p>
+      <w:r>
+        <w:t>A. Resource Suitability Scoring (`backend/services/resource_scoring.py`):</w:t>
+        <w:br/>
+        <w:t xml:space="preserve">   • Solar Suitability Score (0 to 100):</w:t>
+        <w:br/>
+        <w:t xml:space="preserve">     1. Base Irradiance Score (0 to 70 pts): `np.clip((annual_avg_ghi - 2.0) / (6.0 - 2.0) * 70.0, 0.0, 70.0)`.</w:t>
+        <w:br/>
+        <w:t xml:space="preserve">     2. Temperature Derating (0 to 15 pts): PV cell voltage drops above 25°C. `if avg_temp &lt;= 25: 15.0; elif avg_temp &gt;= 40: 5.0; else: 15.0 - ((avg_temp - 25.0) / 15.0 * 10.0)`.</w:t>
+        <w:br/>
+        <w:t xml:space="preserve">     3. Seasonal Consistency (0 to 15 pts): `consistency_ratio = min_ghi / max_ghi; score = np.clip(consistency_ratio * 15.0, 0.0, 15.0)`.</w:t>
+        <w:br/>
+        <w:t xml:space="preserve">   • Wind Suitability Score (0 to 100):</w:t>
+        <w:br/>
+        <w:t xml:space="preserve">     1. Wind Shear Hub Extrapolation: `mean_speed_hub = mean_speed_10m * ((40.0 / 10.0) ** 0.143)` (Hellman wind shear law).</w:t>
+        <w:br/>
+        <w:t xml:space="preserve">     2. Base Speed Score (0 to 50 pts): Scaled piecewise (&lt;3.0 m/s: poor; 3.0-6.5 m/s: moderate/good; &gt;6.5 m/s: excellent).</w:t>
+        <w:br/>
+        <w:t xml:space="preserve">     3. Cut-In Availability Score (0 to 30 pts): `(effective_speeds &gt;= 3.0).sum() / len(effective_speeds) * 30.0`.</w:t>
+        <w:br/>
+        <w:t xml:space="preserve">     4. Wind Power Density (WPD) Score (0 to 20 pts): `wpd = 0.5 * 1.225 * mean(v^3); score = np.clip((wpd / 200.0) * 20.0, 0.0, 20.0)`.</w:t>
         <w:br/>
         <w:br/>
-        <w:t>2. CIRCULAR WIND DIRECTION MATHEMATICS:</w:t>
+        <w:t>B. Rooftop Shadow &amp; Azimuth Micro-Placement (`backend/services/rooftop_shadow_service.py`):</w:t>
         <w:br/>
-        <w:t xml:space="preserve">   • Crucial viva concept: Standard arithmetic averaging of wind angles fails because 359° and 1° average to 180° (South) instead of 0° (North).</w:t>
+        <w:t xml:space="preserve">   • Astronomical Sun Position: Function `calculate_solar_angles(lat, DOY, solar_hour)` computes declination `delta = 23.45 * sin(360/365 * (DOY - 81))`, hour angle `omega = 15 * (hour - 12)`, altitude `sin(alpha) = sin(lat)*sin(delta) + cos(lat)*cos(delta)*cos(omega)`, and azimuth `gamma_s`.</w:t>
         <w:br/>
-        <w:t xml:space="preserve">   • Member 1 implemented vector decomposition across all 8,760 hourly readings:</w:t>
+        <w:t xml:space="preserve">   • Winter Solstice Shadow: Sun is lowest on Dec 21 (`DOY = 355`). The shadow length is `L = neighbor_height / tan(radians(alpha_winter))`.</w:t>
         <w:br/>
-        <w:t xml:space="preserve">     u_bar = (1/N) * sum(sin(rad(theta))),  v_bar = (1/N) * sum(cos(rad(theta)))</w:t>
+        <w:t xml:space="preserve">   • Plot Penetration: `shadow_penetration_m = max(0.0, L - neighbor_distance_m)`. Shaded area is subtracted to yield `effective_unshaded_solar_area_m2`.</w:t>
         <w:br/>
-        <w:t xml:space="preserve">     theta_mean = atan2(u_bar, v_bar) mod 360°</w:t>
-        <w:br/>
-        <w:t xml:space="preserve">   • Proves the prevailing wind vector is 197.82° (South-Southwest), matching the monsoonal atmospheric circulation of the subcontinent.</w:t>
+        <w:t xml:space="preserve">   • Micro-Placement Zoning: Generates 3 discrete placement polygons: Unobstructed Solar Core (Green), Aerodynamic Wind Parapet (Cyan), and Shaded Buffer (Red).</w:t>
         <w:br/>
         <w:br/>
-        <w:t>3. DIGITAL ELEVATION MODEL &amp; VENTURI RIDGE ACCELERATION (`terrain_service.py`):</w:t>
+        <w:t>C. Physical Energy Generation Simulation (`backend/services/energy_model.py`):</w:t>
         <w:br/>
-        <w:t xml:space="preserve">   • Queries Open-Elevation SRTM data using a 3-point coordinate triangle: (lat, lon), (lat+0.01, lon), (lat, lon+0.01).</w:t>
+        <w:t xml:space="preserve">   • Solar PV: Sized at 7.0 m²/kWp. Monthly generation: `gen_kwh = capacity_kw * ghi * days_in_month * 0.78`.</w:t>
         <w:br/>
-        <w:t xml:space="preserve">   • Computes elevation gradient d_north, d_east over ~1,110 meters and calculates topographic slope gradient s.</w:t>
+        <w:t xml:space="preserve">   • Wind Turbine: Evaluates function `turbine_power_kw(v, rated_kw)` across all 8,760 hourly speeds:</w:t>
         <w:br/>
-        <w:t xml:space="preserve">   • If an elevated ridge (&gt;600m) is detected, applies boundary-layer aerodynamic compression: S = 1.0 + min(0.35, s * 2.5), giving up to a 1.35x wind boost.</w:t>
+        <w:t xml:space="preserve">     - If $v &lt; 3.0$ or $v &gt; 25.0\ m/s$: Power = $0\ kW$.</w:t>
         <w:br/>
+        <w:t xml:space="preserve">     - If $v \ge 10.5\ m/s$: Power = $P_{rated}$.</w:t>
         <w:br/>
-        <w:t>4. DATA QUALITY VALIDATOR (`scripts/validate_weather_data.py`):</w:t>
-        <w:br/>
-        <w:t xml:space="preserve">   • Automated validator script that checks every file for physical bounds (GHI: 0-14, Temp: -60 to 60, Wind: 0-75 m/s).</w:t>
-        <w:br/>
-        <w:t xml:space="preserve">   • Scans for NASA sentinel values (-999) and duplicate dates. Generates `reports/data_quality_results.json` confirming 0 missing values in runtime files.</w:t>
+        <w:t xml:space="preserve">     - If $3.0 \le v &lt; 10.5\ m/s$: Power = $P_{rated} </w:t>
+        <w:tab/>
+        <w:t>imes ((v - 3.0) / (10.5 - 3.0))^{2.5}$.</w:t>
       </w:r>
     </w:p>
     <w:p>
@@ -669,16 +1104,16 @@
         <w:rPr>
           <w:b/>
           <w:color w:val="123456"/>
-          <w:sz w:val="36"/>
+          <w:sz w:val="34"/>
         </w:rPr>
-        <w:t>Section 4: Member 2 — Resource Scoring, Shadow Modeling &amp; Energy Physics</w:t>
+        <w:t>Section 5: Member 3 — Techno-Economics, Hardware Catalogs &amp; Decision Engine</w:t>
       </w:r>
     </w:p>
     <w:p>
       <w:r>
-        <w:t>Title: Lead Renewable Energy Physicist &amp; Simulation Engineer</w:t>
+        <w:t>Techno-Economics &amp; Hardware Lead | Focus: 25-Year DCF Financials, Turbine Catalog, BESS Sizing &amp; Decision Matrix</w:t>
         <w:br/>
-        <w:t>Files Owned: backend/services/resource_scoring.py, backend/services/energy_model.py, backend/services/rooftop_shadow_service.py</w:t>
+        <w:t>Files: `backend/services/economics_service.py`, `backend/services/recommendation_engine.py`, `backend/services/wind_turbine_catalog.py`, `backend/services/bess_service.py`</w:t>
       </w:r>
     </w:p>
     <w:p>
@@ -690,50 +1125,90 @@
         <w:rPr>
           <w:b/>
           <w:color w:val="107C41"/>
-          <w:sz w:val="28"/>
+          <w:sz w:val="26"/>
         </w:rPr>
-        <w:t>What Member 2 Must Explain From Start to Finish:</w:t>
+        <w:t>1. Technologies Used &amp; Why:</w:t>
       </w:r>
     </w:p>
     <w:p>
       <w:r>
-        <w:t>1. MULTI-FACTOR RESOURCE SUITABILITY SCORING (`resource_scoring.py`):</w:t>
+        <w:t>• Discounted Cash Flow (DCF) Financial Modeling: Incorporates time value of money, annual degradation, and OPEX.</w:t>
         <w:br/>
-        <w:t xml:space="preserve">   • Solar Score (0 to 100 points):</w:t>
+        <w:t>• Python Dictionary Data Structures: Encapsulates standardized commercial turbine hardware specifications.</w:t>
         <w:br/>
-        <w:t xml:space="preserve">     - Base Irradiance (0-70 pts): Scaled linearly from 2.0 kWh/m²/day (0 pts) to 6.0 kWh/m²/day (70 pts).</w:t>
+        <w:t>• Rule-Based Multi-Criteria Decision Tree: Deterministic logic mapping suitability scores and financials to verdicts without black-box opacity.</w:t>
         <w:br/>
-        <w:t xml:space="preserve">     - Temperature Derating (0-15 pts): PV cell efficiency drops ~0.4%/°C above 25°C. Full 15 pts if avg temp &lt;= 25°C; decreases to 5 pts at 40°C.</w:t>
+        <w:t>• Electrochemical Modeling: Sizing Lithium Iron Phosphate (LiFePO4) storage for peak shaving and night autonomy.</w:t>
+      </w:r>
+    </w:p>
+    <w:p>
+      <w:pPr>
+        <w:pStyle w:val="Heading2"/>
+        <w:spacing w:before="280" w:after="120"/>
+      </w:pPr>
+      <w:r>
+        <w:rPr>
+          <w:b/>
+          <w:color w:val="107C41"/>
+          <w:sz w:val="26"/>
+        </w:rPr>
+        <w:t>2. How It Is Implemented in Code:</w:t>
+      </w:r>
+    </w:p>
+    <w:p>
+      <w:r>
+        <w:t>A. Techno-Economic Feasibility Engine (`backend/services/economics_service.py`):</w:t>
         <w:br/>
-        <w:t xml:space="preserve">     - Seasonal Consistency (0-15 pts): Min monthly GHI / Max monthly GHI ratio. High consistency avoids winter generation deficits.</w:t>
+        <w:t xml:space="preserve">   • Capital Benchmarks: Solar CAPEX = ₹50,000/kW (OPEX = 1.5%/yr). Wind CAPEX = ₹95,000/kW (OPEX = 3.0%/yr).</w:t>
         <w:br/>
-        <w:t xml:space="preserve">   • Wind Score (0 to 100 points):</w:t>
+        <w:t xml:space="preserve">   • Net Metering Revenue Formula: Self-consumed energy saves 100% of tariff; surplus energy exported to grid earns 50% export tariff:</w:t>
         <w:br/>
-        <w:t xml:space="preserve">     - Speed Score (0-50 pts): Extrapolated to hub height via wind shear law: v_hub = v_10m * (40/10)^0.143.</w:t>
+        <w:t xml:space="preserve">     `savings = (usable_energy * tariff) + (surplus_energy * tariff * 0.5)`</w:t>
         <w:br/>
-        <w:t xml:space="preserve">     - Operating Hours / Cut-in Availability (0-30 pts): % of hours where effective wind speed &gt;= 3.0 m/s.</w:t>
+        <w:t xml:space="preserve">   • 25-Year Discounted Net Present Value (NPV):</w:t>
         <w:br/>
-        <w:t xml:space="preserve">     - Wind Power Density (WPD) (0-20 pts): WPD = 0.5 * rho * v³ (rho = 1.225 kg/m³). Scaled up to 200 W/m².</w:t>
+        <w:t xml:space="preserve">     `solar_npv = -solar_capex`</w:t>
+        <w:br/>
+        <w:t xml:space="preserve">     `for year in range(1, 26):`</w:t>
+        <w:br/>
+        <w:t xml:space="preserve">     `    yearly_cash = (annual_savings * ((1 - 0.005) ** (year - 1))) - opex`</w:t>
+        <w:br/>
+        <w:t xml:space="preserve">     `    solar_npv += yearly_cash / ((1 + 0.08) ** year)`</w:t>
+        <w:br/>
+        <w:t xml:space="preserve">   • Simple Payback Period: `payback_years = capex / net_annual_cashflow`.</w:t>
+        <w:br/>
+        <w:t xml:space="preserve">   • LCOE: `capex / (annual_kwh * 25 * 0.9)` (Levelized Cost of Energy in INR/kWh).</w:t>
         <w:br/>
         <w:br/>
-        <w:t>2. ROOFTOP SHADOW &amp; SOLAR MICRO-PLACEMENT (`rooftop_shadow_service.py`):</w:t>
+        <w:t>B. Commercial Wind Turbine Catalog (`backend/services/wind_turbine_catalog.py`):</w:t>
         <w:br/>
-        <w:t xml:space="preserve">   • Astronomical Solar Angles: Calculates solar declination delta = 23.45 * sin(360/365 * (DOY - 81)), hour angle omega = 15° * (solar_hour - 12), and solar altitude alpha.</w:t>
+        <w:t xml:space="preserve">   • Houses standardized database `WIND_TURBINE_MODELS` with 4 verified commercial units:</w:t>
         <w:br/>
-        <w:t xml:space="preserve">   • Critical Winter Solstice Shadow: Sun is lowest on Dec 21 (DOY 355). Calculates shadow length L = Neighbor_Height / tan(alpha_winter). Calculates shadow penetration into user's plot after subtracting neighbor distance.</w:t>
+        <w:t xml:space="preserve">     1. HelixUrban V-800: 0.8 kW VAWT, 1.8 m/s cut-in, 34 dB noise, ₹85,000 CAPEX.</w:t>
         <w:br/>
-        <w:t xml:space="preserve">   • Optimal Orientation: Identifies optimal panel tilt (approx. latitude ± 5°) and azimuth (180° True South in Northern Hemisphere).</w:t>
+        <w:t xml:space="preserve">     2. Aeolus Tower-2K: 2.0 kW VAWT, 2.2 m/s cut-in, 38 dB noise, ₹165,000 CAPEX.</w:t>
         <w:br/>
-        <w:t xml:space="preserve">   • Micro-Placement Heatmap: Generates 3 discrete placement zones (Unobstructed Solar Core, Aerodynamic Wind Parapet, and Shaded Boundary Buffer).</w:t>
+        <w:t xml:space="preserve">     3. Zephyr-3200: 3.2 kW HAWT, 2.8 m/s cut-in, 46 dB noise, ₹240,000 CAPEX.</w:t>
+        <w:br/>
+        <w:t xml:space="preserve">     4. Boreas-10K: 10.0 kW Industrial HAWT, 3.0 m/s cut-in, 7.2m rotor, ₹680,000 CAPEX.</w:t>
+        <w:br/>
+        <w:t xml:space="preserve">   • Selection Constraints: If `site_category == 'residential_rooftop'`, code strictly selects VAWT models to protect structural integrity from acoustic resonance and vibration.</w:t>
         <w:br/>
         <w:br/>
-        <w:t>3. PHYSICAL ENERGY GENERATION SIMULATION (`energy_model.py`):</w:t>
+        <w:t>C. Battery Energy Storage System (BESS) Sizing (`backend/services/bess_service.py`):</w:t>
         <w:br/>
-        <w:t xml:space="preserve">   • Solar PV Capacity: Sized at 7.0 m² per kW. Monthly generation = Capacity (kW) * GHI * Days * 0.78 (PR).</w:t>
+        <w:t xml:space="preserve">   • Sizing formula: `effective_storage_needed = (daily_load / 24 * backup_hours) / (0.85 * 0.92)`.</w:t>
         <w:br/>
-        <w:t xml:space="preserve">   • Wind Power Simulation: For all 8,760 hourly readings, evaluates continuous aerodynamic cubic power curve between cut-in (3.0 m/s), rated (10.5 m/s), and cut-out (25.0 m/s).</w:t>
+        <w:t xml:space="preserve">   • Computes 5 kWh modular pack counts: `module_count = math.ceil(effective_storage_needed / 5.0)`.</w:t>
         <w:br/>
-        <w:t xml:space="preserve">   • Aggregates into 12-month solar and wind kWh yields, computing total annual load offset %.</w:t>
+        <w:t xml:space="preserve">   • Costing: `battery_capex = installed_kwh * 13500.0` (₹13,500/kWh for LiFePO4 cells + BMS + inverter).</w:t>
+        <w:br/>
+        <w:br/>
+        <w:t>D. Multi-Criteria Decision Engine (`backend/services/recommendation_engine.py`):</w:t>
+        <w:br/>
+        <w:t xml:space="preserve">   • Evaluates suitability thresholds: Solar viable if score &gt;= 50 and payback &lt;= 14 yrs. Wind viable if score &gt;= 48 or payback &lt;= 14 yrs.</w:t>
+        <w:br/>
+        <w:t xml:space="preserve">   • Decision Logic: If both viable -&gt; 'Solar-Wind Hybrid System'. If only solar viable -&gt; 'Rooftop / Ground Solar PV'. If wind dominant -&gt; 'Wind Turbine System'. Generates dynamic justification text.</w:t>
       </w:r>
     </w:p>
     <w:p>
@@ -750,18 +1225,16 @@
         <w:rPr>
           <w:b/>
           <w:color w:val="123456"/>
-          <w:sz w:val="36"/>
+          <w:sz w:val="34"/>
         </w:rPr>
-        <w:t>Section 5: Member 3 — Techno-Economics, Hardware Catalogs &amp; Decision Engine</w:t>
+        <w:t>Section 6: Member 4 — Interactive Frontend, GIS UI &amp; Security Verification</w:t>
       </w:r>
     </w:p>
     <w:p>
       <w:r>
-        <w:t>Title: Lead Techno-Economist &amp; Renewable Systems Architect</w:t>
+        <w:t>Lead Full-Stack Integrator &amp; Security QA Lead | Focus: FastAPI Routing, Leaflet GIS, Drone Vision &amp; Automated Testing</w:t>
         <w:br/>
-        <w:t>Files Owned: backend/services/economics_service.py, backend/services/recommendation_engine.py, backend/services/wind_turbine_catalog.py, backend/services/bess_service.py</w:t>
-        <w:br/>
-        <w:t>Deliverables Owned: backend/data/techno_economics.json, backend/data/final_recommendation.json</w:t>
+        <w:t>Files: `backend/main.py`, `index.html`, `backend/services/rooftop_image_service.py`, `backend/services/regional_scanner.py`, `tests/test_api.py`</w:t>
       </w:r>
     </w:p>
     <w:p>
@@ -773,57 +1246,86 @@
         <w:rPr>
           <w:b/>
           <w:color w:val="107C41"/>
-          <w:sz w:val="28"/>
+          <w:sz w:val="26"/>
         </w:rPr>
-        <w:t>What Member 3 Must Explain From Start to Finish:</w:t>
+        <w:t>1. Technologies Used &amp; Why:</w:t>
       </w:r>
     </w:p>
     <w:p>
       <w:r>
-        <w:t>1. FINANCIAL &amp; CASH FLOW MODELING (`economics_service.py`):</w:t>
+        <w:t>• FastAPI &amp; Pydantic v2: High-speed asynchronous Python web framework with automatic OpenAPI documentation and strict data validation.</w:t>
         <w:br/>
-        <w:t xml:space="preserve">   • Benchmarks: Solar CAPEX = ₹50,000/kW (OPEX = 1.5%/yr). Wind CAPEX = ₹95,000/kW (OPEX = 3.0%/yr).</w:t>
+        <w:t>• Leaflet.js 1.9.4: Open-source interactive mapping library supporting multiple raster tile layers.</w:t>
         <w:br/>
-        <w:t xml:space="preserve">   • Net Metering Revenue: Directly consumed generation saves 100% of tariff (e.g. ₹7.5/kWh); surplus exported to grid earns 50% tariff (₹3.75/kWh).</w:t>
+        <w:t>• Chart.js 4.4: Canvas-based responsive charting for the 180° semicircle Siting Index gauge and 12-month generation forecast.</w:t>
         <w:br/>
-        <w:t xml:space="preserve">   • 25-Year Discounted Net Present Value (NPV):</w:t>
+        <w:t>• Pillow &amp; piexif: Binary image header parsing and EXIF metadata extraction.</w:t>
         <w:br/>
-        <w:t xml:space="preserve">     NPV = -CAPEX + sum_{t=1}^{25} [ (Savings_t * (1 - 0.005)^(t-1) - OPEX) / (1 + r)^t ], where r = 8% discount rate and 0.5%/yr PV degradation.</w:t>
+        <w:t>• Pytest &amp; HTTPX: Automated REST API integration and security vulnerability testing.</w:t>
+      </w:r>
+    </w:p>
+    <w:p>
+      <w:pPr>
+        <w:pStyle w:val="Heading2"/>
+        <w:spacing w:before="280" w:after="120"/>
+      </w:pPr>
+      <w:r>
+        <w:rPr>
+          <w:b/>
+          <w:color w:val="107C41"/>
+          <w:sz w:val="26"/>
+        </w:rPr>
+        <w:t>2. How It Is Implemented in Code:</w:t>
+      </w:r>
+    </w:p>
+    <w:p>
+      <w:r>
+        <w:t>A. FastAPI Server Architecture (`backend/main.py`):</w:t>
         <w:br/>
-        <w:t xml:space="preserve">   • Simple Payback Period = CAPEX / Net Annual Cash Flow.</w:t>
+        <w:t xml:space="preserve">   • Defines Pydantic models `SiteAnalysisRequest` and `RegionalScanRequest` with strict boundary constraints (`ge=-90, le=90`, regex pattern for site categories).</w:t>
         <w:br/>
-        <w:t xml:space="preserve">   • Levelized Cost of Energy (LCOE) = Total Lifetime Sunk Cost / Lifetime kWh Generation.</w:t>
+        <w:t xml:space="preserve">   • Endpoints: `GET /` (serves index.html), `GET /api/health`, `POST /api/analyze-site`, `POST /api/regional-scan`, and `POST /api/upload-rooftop-image`.</w:t>
+        <w:br/>
+        <w:t xml:space="preserve">   • Concurrency Safety: Introduces `_SITE_ANALYSIS_LOCK = Lock()` around `analyze_site` to prevent file-write race conditions.</w:t>
+        <w:br/>
+        <w:t xml:space="preserve">   • CORS Policy: Enforces `CORSMiddleware` with `allow_origins=['*']` and `allow_credentials=False` (prevents credential theft).</w:t>
         <w:br/>
         <w:br/>
-        <w:t>2. SPECIFIC WIND TURBINE HARDWARE CATALOG (`wind_turbine_catalog.py`):</w:t>
+        <w:t>B. Interactive Leaflet GIS &amp; Hallmark UI (`index.html`):</w:t>
         <w:br/>
-        <w:t xml:space="preserve">   • Built a real catalog of 4 commercial turbines:</w:t>
+        <w:t xml:space="preserve">   • Map Initialization: `L.map('map', { zoomControl: false, zoomSnap: 0.25, zoomDelta: 0.5, wheelPxPerZoomLevel: 70, inertia: true, inertiaDeceleration: 2000 })`.</w:t>
         <w:br/>
-        <w:t xml:space="preserve">     1. HelixUrban V-800: 0.8 kW VAWT, 1.8 m/s cut-in, 34 dB noise, designed for residential rooftops.</w:t>
+        <w:t xml:space="preserve">   • 3 Layer Switcher: OpenStreetMap Streets, ESRI World Imagery Satellite, and OpenTopoMap Topography.</w:t>
         <w:br/>
-        <w:t xml:space="preserve">     2. Aeolus Tower-2K: 2.0 kW VAWT, 2.2 m/s cut-in, 38 dB noise, designed for commercial buildings.</w:t>
+        <w:t xml:space="preserve">   • 4 Floating Map Controls: Zoom In (`map.zoomIn()`), Zoom Out (`map.zoomOut()`), Center Active Pin (`centerOnActivePin()`), and GPS Location (`locateUserPosition()`).</w:t>
         <w:br/>
-        <w:t xml:space="preserve">     3. Zephyr-3200: 3.2 kW HAWT, 2.8 m/s cut-in, guyed mast, designed for farmlands.</w:t>
+        <w:t xml:space="preserve">   • Search Bar Glitch Fix: The `input` listener only toggles the clear `✕` button; API calls only trigger on `Enter` key or map click, preventing mid-keystroke glitches.</w:t>
         <w:br/>
-        <w:t xml:space="preserve">     4. Boreas-10K: 10.0 kW Industrial HAWT, 3.0 m/s cut-in, 7.2m rotor diameter, designed for open plains/ridges.</w:t>
-        <w:br/>
-        <w:t xml:space="preserve">   • Selection logic strictly enforces building safety: Residential sites can ONLY select silent Vertical-Axis turbines to avoid structural vibration.</w:t>
+        <w:t xml:space="preserve">   • Dynamic SVG Artwork Card: Styled with `.hero-media-card { height: 100%; }` and `.media-card-art svg { width: 100%; height: 100%; object-fit: cover; }`. Function `renderRecommendationArt(verdict)` dynamically swaps SVG vector art between Solar, Wind, and Hybrid scenes.</w:t>
         <w:br/>
         <w:br/>
-        <w:t>3. BATTERY ENERGY STORAGE SYSTEM (BESS) SIZING (`bess_service.py`):</w:t>
+        <w:t>C. Drone Photo Computer Vision (`backend/services/rooftop_image_service.py`):</w:t>
         <w:br/>
-        <w:t xml:space="preserve">   • Chemistry: Lithium Iron Phosphate (LiFePO4) - 6000+ cycle lifespan, thermally fire-safe.</w:t>
+        <w:t xml:space="preserve">   • Upload Validation: Enforces 15 MB file ceiling and whitelists `image/jpeg`, `image/png`, and `image/webp`.</w:t>
         <w:br/>
-        <w:t xml:space="preserve">   • Sizing formula: Storage_kWh = (Daily_Consumption / 24 * Desired_Backup_Hours) / (DoD * Efficiency), where DoD = 85% and Round-Trip Efficiency = 92%.</w:t>
+        <w:t xml:space="preserve">   • EXIF Extraction: Uses `piexif.load()` to parse GPS IFD tags (GPSLatitude, GPSLongitude, GPSAltitude). Converts DMS (Degrees, Minutes, Seconds) to decimal degrees. Frontend receives GPS and auto-pans the map via `map.setView([lat, lon], 17)`.</w:t>
         <w:br/>
-        <w:t xml:space="preserve">   • Costing: ₹13,500 per kWh of usable storage. Strictly scoped to battery sizing and CAPEX (no carbon calculations).</w:t>
+        <w:t xml:space="preserve">   • Obstruction Analysis: Converts image to grayscale, calculates Laplacian edge variance and entropy, scoring obstruction density into Low (&lt;20%), Medium, or High.</w:t>
         <w:br/>
         <w:br/>
-        <w:t>4. MULTI-CRITERIA DECISION TREE (`recommendation_engine.py`):</w:t>
+        <w:t>D. Pytest QA &amp; Security Test Suite (`tests/test_api.py`):</w:t>
         <w:br/>
-        <w:t xml:space="preserve">   • Cross-evaluates solar vs wind resource scores, financial payback (&lt;14 years is viable), and physical site area.</w:t>
+        <w:t xml:space="preserve">   • 78 automated test cases passing in 72 seconds covering:</w:t>
         <w:br/>
-        <w:t xml:space="preserve">   • Synthesizes the final authoritative verdict and generates a technical engineering justification text.</w:t>
+        <w:t xml:space="preserve">     - API Contract Integrity: Validates all JSON keys match frontend reads.</w:t>
+        <w:br/>
+        <w:t xml:space="preserve">     - Input Validation: 23 boundary tests verifying 422 HTTP responses on out-of-range inputs.</w:t>
+        <w:br/>
+        <w:t xml:space="preserve">     - Injection Immunity: Verifies 422 rejection on SQL injection strings (`'; DROP TABLE;`) and XSS payloads (`&lt;script&gt;alert(1)&lt;/script&gt;`).</w:t>
+        <w:br/>
+        <w:t xml:space="preserve">     - File Upload Security: Rejects ZIP bombs (400), HTML files (400), oversized files &gt;15MB (413), and sanitizes path traversal (`Path(filename).name`).</w:t>
+        <w:br/>
+        <w:t xml:space="preserve">     - E2E Happy Paths: 6 complete flows verifying Solar, Wind, Hybrid, BESS &gt;0, and CAPEX mathematical consistency.</w:t>
       </w:r>
     </w:p>
     <w:p>
@@ -840,79 +1342,62 @@
         <w:rPr>
           <w:b/>
           <w:color w:val="123456"/>
-          <w:sz w:val="36"/>
+          <w:sz w:val="34"/>
         </w:rPr>
-        <w:t>Section 6: Member 4 — Interactive Frontend, GIS UI &amp; Security Verification</w:t>
+        <w:t>Section 7: Pipeline Mechanics: How Modules Work Independently &amp; Jointly</w:t>
       </w:r>
     </w:p>
     <w:p>
       <w:r>
-        <w:t>Title: Lead Full-Stack Integrator &amp; Security QA Lead</w:t>
-        <w:br/>
-        <w:t>Files Owned: backend/main.py, index.html, backend/services/rooftop_image_service.py, backend/services/regional_scanner.py, tests/test_api.py</w:t>
-      </w:r>
-    </w:p>
-    <w:p>
-      <w:pPr>
-        <w:pStyle w:val="Heading2"/>
-        <w:spacing w:before="280" w:after="120"/>
-      </w:pPr>
-      <w:r>
-        <w:rPr>
-          <w:b/>
-          <w:color w:val="107C41"/>
-          <w:sz w:val="28"/>
-        </w:rPr>
-        <w:t>What Member 4 Must Explain From Start to Finish:</w:t>
+        <w:t>To present convincingly, the team must explain both the standalone modularity of each script and their sequential coordination inside `backend/main.py` when an end-user triggers site optimization:</w:t>
       </w:r>
     </w:p>
     <w:p>
       <w:r>
-        <w:t>1. REST API ARCHITECTURE (`backend/main.py`):</w:t>
+        <w:t>1. Independent Execution (Standalone Modularity):</w:t>
         <w:br/>
-        <w:t xml:space="preserve">   • Built on FastAPI. Exposes 3 core endpoints:</w:t>
+        <w:t xml:space="preserve">   • Member 1's `weather_service.py` can be run independently from CLI to fetch and save satellite CSVs for any coordinate.</w:t>
         <w:br/>
-        <w:t xml:space="preserve">     - POST /api/analyze-site: Runs the complete Phase 1 + Phase 2 chain under concurrency lock.</w:t>
+        <w:t xml:space="preserve">   • Member 1's `terrain_service.py` can be called standalone to compute slopes and Venturi multipliers.</w:t>
         <w:br/>
-        <w:t xml:space="preserve">     - POST /api/regional-scan: Generates spatial heatmap raster across 1-50 km radius.</w:t>
+        <w:t xml:space="preserve">   • Member 2's `resource_scoring.py` can evaluate any existing CSV dataset and output 0-100 scores.</w:t>
         <w:br/>
-        <w:t xml:space="preserve">     - POST /api/upload-rooftop-image: Multipart image upload for drone vision and EXIF GPS extraction.</w:t>
+        <w:t xml:space="preserve">   • Member 2's `rooftop_shadow_service.py` can run independently given any plot geometry to output shadow lengths and solar angles.</w:t>
         <w:br/>
-        <w:t xml:space="preserve">   • Strict Pydantic boundary validation on all inputs (lat/lon limits, regex enums for site categories).</w:t>
+        <w:t xml:space="preserve">   • Member 3's `economics_service.py` can compute 25-year DCF tables for any given kWh generation and tariff.</w:t>
+        <w:br/>
+        <w:t xml:space="preserve">   • Member 3's `wind_turbine_catalog.py` and `bess_service.py` can be queried independently with capacity parameters.</w:t>
+        <w:br/>
+        <w:t xml:space="preserve">   • Member 4's `tests/test_api.py` can run against the backend in isolation to verify contract integrity.</w:t>
         <w:br/>
         <w:br/>
-        <w:t>2. INTERACTIVE LEAFLET GIS FRONTEND (`index.html`):</w:t>
+        <w:t>2. Joint Pipeline Coordination (The Live User Flow):</w:t>
         <w:br/>
-        <w:t xml:space="preserve">   • Multi-layer map: OpenStreetMap Street view, ESRI High-Resolution Satellite imagery, and OpenTopoMap elevation topography.</w:t>
+        <w:t xml:space="preserve">   Step 1: User clicks on the Leaflet map or types coordinates in the search box.</w:t>
         <w:br/>
-        <w:t xml:space="preserve">   • Google Maps-level smooth zoom: Configured with zoomSnap: 0.25, zoomDelta: 0.5, wheelPxPerZoomLevel: 70, and momentum inertia.</w:t>
+        <w:t xml:space="preserve">   Step 2: Frontend JS packages JSON payload and issues `POST http://127.0.0.1:8000/api/analyze-site`.</w:t>
         <w:br/>
-        <w:t xml:space="preserve">   • 4 Quick Map Controls: Floating pill with Zoom In (+), Zoom Out (-), Center on Active Pin, and GPS Geolocation button.</w:t>
+        <w:t xml:space="preserve">   Step 3: FastAPI acquires `_SITE_ANALYSIS_LOCK` to ensure single-tenant file safety.</w:t>
         <w:br/>
-        <w:t xml:space="preserve">   • Search Bar Glitch Fix: Added clear (✕) button and eliminated mid-keystroke erratic API calls; search only triggers on Enter or explicit submission.</w:t>
+        <w:t xml:space="preserve">   Step 4: `terrain_service.py` (Member 1) executes -&gt; returns elevation &amp; wind speedup factor.</w:t>
         <w:br/>
-        <w:t xml:space="preserve">   • Dynamic SVG Artwork Card: Middle card (left of Siting Index) features 100% container-fitted vector landscape art that dynamically changes SVG scene depending on Solar, Wind, or Hybrid verdict.</w:t>
+        <w:t xml:space="preserve">   Step 5: `weather_service.py` (Member 1) executes -&gt; downloads/validates 365 daily &amp; 8,760 hourly readings.</w:t>
         <w:br/>
+        <w:t xml:space="preserve">   Step 6: `resource_scoring.py` (Member 2) executes -&gt; calculates 0-100 Solar &amp; Wind suitability scores.</w:t>
         <w:br/>
-        <w:t>3. DRONE VISION &amp; EXIF GPS EXTRACTOR (`rooftop_image_service.py`):</w:t>
+        <w:t xml:space="preserve">   Step 7: `rooftop_shadow_service.py` (Member 2) executes -&gt; computes winter shadow and effective unshaded area.</w:t>
         <w:br/>
-        <w:t xml:space="preserve">   • Enforces 15 MB file ceiling and whitelists JPEG/PNG/WebP.</w:t>
+        <w:t xml:space="preserve">   Step 8: `energy_model.py` (Member 2) executes -&gt; simulates monthly kWh generation using unshaded area and speedup.</w:t>
         <w:br/>
-        <w:t xml:space="preserve">   • Extracts EXIF GPS tags (latitude/longitude) using Pillow/piexif. If detected, the map immediately auto-pans to the drone photo coordinates.</w:t>
+        <w:t xml:space="preserve">   Step 9: `economics_service.py` (Member 3) executes -&gt; evaluates 25-year NPV, payback period, and LCOE.</w:t>
         <w:br/>
-        <w:t xml:space="preserve">   • Analyzes surface texture entropy and edge density to classify obstruction risk (Low/Medium/High).</w:t>
+        <w:t xml:space="preserve">   Step 10: `recommendation_engine.py` (Member 3) executes -&gt; issues final system verdict and explanation.</w:t>
         <w:br/>
+        <w:t xml:space="preserve">   Step 11: `wind_turbine_catalog.py` &amp; `bess_service.py` (Member 3) execute -&gt; select hardware model and size LiFePO4 battery.</w:t>
         <w:br/>
-        <w:t>4. REGIONAL SPATIAL HEATMAP SCANNER (`regional_scanner.py`):</w:t>
+        <w:t xml:space="preserve">   Step 12: FastAPI releases lock and returns unified JSON response.</w:t>
         <w:br/>
-        <w:t xml:space="preserve">   • Evaluates a multi-point spatial grid (3x3 to 9x9) around the location to classify regional energy zones into Solar Hotspots (amber), Wind Corridors (teal), and Hybrid Prime (blue).</w:t>
-        <w:br/>
-        <w:br/>
-        <w:t>5. COMPREHENSIVE QA &amp; SECURITY SUITE (`tests/test_api.py`):</w:t>
-        <w:br/>
-        <w:t xml:space="preserve">   • 78/78 tests passing in 72 seconds covering API contract integrity, 422 validation, SQL injection immunity, XSS payload rejection, path traversal sanitization, and end-to-end user flows.</w:t>
-        <w:br/>
-        <w:t xml:space="preserve">   • Bandit static security scan: 1,341 lines clean (0 issues). Pip-audit: 0 known vulnerabilities. Semgrep: 187 rules passed.</w:t>
+        <w:t xml:space="preserve">   Step 13: `index.html` (Member 4) reactively updates all DOM elements, Siting Index gauge, 12-month generation charts, and SVG vector art without browser reload.</w:t>
       </w:r>
     </w:p>
     <w:p>
@@ -929,14 +1414,14 @@
         <w:rPr>
           <w:b/>
           <w:color w:val="123456"/>
-          <w:sz w:val="36"/>
+          <w:sz w:val="34"/>
         </w:rPr>
-        <w:t>Section 7: Complete Project Directory Structure &amp; File Inventory</w:t>
+        <w:t>Section 8: Complete Project Directory Structure &amp; File Inventory</w:t>
       </w:r>
     </w:p>
     <w:p>
       <w:r>
-        <w:t>This breakdown explains every file and directory in `Desktop\AI` so that any team member can immediately explain its purpose and role to the professor:</w:t>
+        <w:t>A complete mapping of every file in `Desktop\AI`, explaining its contents, technologies, and usage:</w:t>
       </w:r>
     </w:p>
     <w:tbl>
@@ -978,7 +1463,7 @@
                 <w:b/>
                 <w:color w:val="FFFFFF"/>
               </w:rPr>
-              <w:t>Technical Purpose &amp; Contents</w:t>
+              <w:t>Technologies &amp; Contents</w:t>
             </w:r>
           </w:p>
         </w:tc>
@@ -993,7 +1478,7 @@
                 <w:b/>
                 <w:color w:val="FFFFFF"/>
               </w:rPr>
-              <w:t>How It Relates to the Overall Project</w:t>
+              <w:t>Role in Project</w:t>
             </w:r>
           </w:p>
         </w:tc>
@@ -1024,7 +1509,7 @@
               <w:spacing w:after="40"/>
             </w:pPr>
             <w:r>
-              <w:t>Single-Page Web Application (Vanilla HTML5, CSS3, JS, Leaflet GIS, Chart.js)</w:t>
+              <w:t>Vanilla HTML5, CSS3, JS (ES6+), Leaflet.js, Chart.js</w:t>
             </w:r>
           </w:p>
         </w:tc>
@@ -1037,7 +1522,7 @@
               <w:spacing w:after="40"/>
             </w:pPr>
             <w:r>
-              <w:t>The primary user interface. Renders the interactive map, parameter control pills, Siting Index gauge, 12-month generation charts, and dynamic SVG artwork.</w:t>
+              <w:t>Frontend user interface dashboard. Houses map layers, control pills, Siting Index gauge, charts, and SVG vector art.</w:t>
             </w:r>
           </w:p>
         </w:tc>
@@ -1068,7 +1553,7 @@
               <w:spacing w:after="40"/>
             </w:pPr>
             <w:r>
-              <w:t>FastAPI REST API server application</w:t>
+              <w:t>Python, FastAPI, Starlette, Uvicorn, Pydantic v2</w:t>
             </w:r>
           </w:p>
         </w:tc>
@@ -1081,7 +1566,7 @@
               <w:spacing w:after="40"/>
             </w:pPr>
             <w:r>
-              <w:t>The central coordinator. Receives HTTP requests from the frontend, executes services sequentially, and returns unified JSON responses.</w:t>
+              <w:t>FastAPI REST API server. Handles routing, request validation, CORS, and sequential micro-service orchestration.</w:t>
             </w:r>
           </w:p>
         </w:tc>
@@ -1112,7 +1597,7 @@
               <w:spacing w:after="40"/>
             </w:pPr>
             <w:r>
-              <w:t>Meteorological acquisition service</w:t>
+              <w:t>Python, requests, pandas, Open-Meteo, NASA POWER</w:t>
             </w:r>
           </w:p>
         </w:tc>
@@ -1125,7 +1610,7 @@
               <w:spacing w:after="40"/>
             </w:pPr>
             <w:r>
-              <w:t>Fetches 1-year daily solar radiation and 8,760 hourly wind observations from Open-Meteo ERA5 Reanalysis and NASA POWER.</w:t>
+              <w:t>Meteorological service. Fetches 365 daily solar and 8,760 hourly wind observations with automatic fallback.</w:t>
             </w:r>
           </w:p>
         </w:tc>
@@ -1156,7 +1641,7 @@
               <w:spacing w:after="40"/>
             </w:pPr>
             <w:r>
-              <w:t>Digital elevation and topography service</w:t>
+              <w:t>Python, requests, math, Open-Elevation SRTM</w:t>
             </w:r>
           </w:p>
         </w:tc>
@@ -1169,7 +1654,7 @@
               <w:spacing w:after="40"/>
             </w:pPr>
             <w:r>
-              <w:t>Samples 3-point coordinates from Open-Elevation SRTM API to calculate slope and boundary-layer Venturi ridge acceleration.</w:t>
+              <w:t>Topography service. Samples 3-point elevation coordinates to compute slope and Venturi wind speedup.</w:t>
             </w:r>
           </w:p>
         </w:tc>
@@ -1200,7 +1685,7 @@
               <w:spacing w:after="40"/>
             </w:pPr>
             <w:r>
-              <w:t>Resource suitability scoring engine</w:t>
+              <w:t>Python, pandas, numpy</w:t>
             </w:r>
           </w:p>
         </w:tc>
@@ -1213,7 +1698,7 @@
               <w:spacing w:after="40"/>
             </w:pPr>
             <w:r>
-              <w:t>Calculates the 0-100 Solar Suitability Score and 0-100 Wind Suitability Score based on irradiance, temperature, wind shear, and WPD.</w:t>
+              <w:t>Scoring engine. Computes 0-100 Solar Suitability Score and 0-100 Wind Suitability Score.</w:t>
             </w:r>
           </w:p>
         </w:tc>
@@ -1244,7 +1729,7 @@
               <w:spacing w:after="40"/>
             </w:pPr>
             <w:r>
-              <w:t>Physical energy simulation engine</w:t>
+              <w:t>Python, pandas, numpy</w:t>
             </w:r>
           </w:p>
         </w:tc>
@@ -1257,7 +1742,7 @@
               <w:spacing w:after="40"/>
             </w:pPr>
             <w:r>
-              <w:t>Simulates monthly and annual electrical energy output (kWh) for solar PV (PR=0.78) and wind turbines using continuous cubic power curves.</w:t>
+              <w:t>Physical simulation engine. Models photovoltaic kWh generation (PR=0.78) and cubic wind turbine power curves.</w:t>
             </w:r>
           </w:p>
         </w:tc>
@@ -1288,7 +1773,7 @@
               <w:spacing w:after="40"/>
             </w:pPr>
             <w:r>
-              <w:t>Techno-economic cash flow engine</w:t>
+              <w:t>Python, json, math</w:t>
             </w:r>
           </w:p>
         </w:tc>
@@ -1301,7 +1786,7 @@
               <w:spacing w:after="40"/>
             </w:pPr>
             <w:r>
-              <w:t>Calculates turnkey CAPEX, annual OPEX, net metering savings, simple payback period, LCOE, and 25-year discounted NPV (8% discount rate).</w:t>
+              <w:t>Cash flow engine. Computes CAPEX, OPEX, net metering savings, payback period, LCOE, and 25-yr discounted NPV (8% rate).</w:t>
             </w:r>
           </w:p>
         </w:tc>
@@ -1332,7 +1817,7 @@
               <w:spacing w:after="40"/>
             </w:pPr>
             <w:r>
-              <w:t>Multi-criteria decision rule engine</w:t>
+              <w:t>Python, json</w:t>
             </w:r>
           </w:p>
         </w:tc>
@@ -1345,7 +1830,7 @@
               <w:spacing w:after="40"/>
             </w:pPr>
             <w:r>
-              <w:t>Synthesizes resource scores, payback feasibility, and site physical limits to recommend Solar, Wind, or Hybrid systems with natural language rationale.</w:t>
+              <w:t>Multi-criteria decision rule engine. Evaluates scores and financials to recommend Solar, Wind, or Hybrid systems.</w:t>
             </w:r>
           </w:p>
         </w:tc>
@@ -1376,7 +1861,7 @@
               <w:spacing w:after="40"/>
             </w:pPr>
             <w:r>
-              <w:t>Rooftop shadow and orientation model</w:t>
+              <w:t>Python, math</w:t>
             </w:r>
           </w:p>
         </w:tc>
@@ -1389,7 +1874,7 @@
               <w:spacing w:after="40"/>
             </w:pPr>
             <w:r>
-              <w:t>Calculates astronomical solar altitude/azimuth, winter solstice obstacle shadow penetration, optimal panel tilt/azimuth, and unshaded solar area.</w:t>
+              <w:t>Shadow geometry service. Computes astronomical sun angles, winter solstice obstacle shadow length, and optimal tilt/azimuth.</w:t>
             </w:r>
           </w:p>
         </w:tc>
@@ -1420,7 +1905,7 @@
               <w:spacing w:after="40"/>
             </w:pPr>
             <w:r>
-              <w:t>Commercial turbine hardware catalog</w:t>
+              <w:t>Python dictionaries</w:t>
             </w:r>
           </w:p>
         </w:tc>
@@ -1433,7 +1918,7 @@
               <w:spacing w:after="40"/>
             </w:pPr>
             <w:r>
-              <w:t>Houses specifications for 4 real commercial turbines (VAWT/HAWT) and enforces site-category structural mounting rules.</w:t>
+              <w:t>Hardware catalog. Contains specs for 4 commercial turbines and enforces residential rooftop mounting safety rules.</w:t>
             </w:r>
           </w:p>
         </w:tc>
@@ -1464,7 +1949,7 @@
               <w:spacing w:after="40"/>
             </w:pPr>
             <w:r>
-              <w:t>Battery energy storage sizing model</w:t>
+              <w:t>Python, math</w:t>
             </w:r>
           </w:p>
         </w:tc>
@@ -1477,7 +1962,7 @@
               <w:spacing w:after="40"/>
             </w:pPr>
             <w:r>
-              <w:t>Sizes LiFePO4 battery storage for desired night backup hours accounting for 85% DoD and 92% round-trip efficiency.</w:t>
+              <w:t>Battery storage model. Sizes LiFePO4 battery capacity for desired backup hours accounting for 85% DoD and 92% efficiency.</w:t>
             </w:r>
           </w:p>
         </w:tc>
@@ -1508,7 +1993,7 @@
               <w:spacing w:after="40"/>
             </w:pPr>
             <w:r>
-              <w:t>Computer vision drone photo analyzer</w:t>
+              <w:t>Python, Pillow, piexif</w:t>
             </w:r>
           </w:p>
         </w:tc>
@@ -1521,7 +2006,7 @@
               <w:spacing w:after="40"/>
             </w:pPr>
             <w:r>
-              <w:t>Processes uploaded drone/rooftop photos, extracts embedded EXIF GPS coordinates for auto-navigation, and estimates obstruction density.</w:t>
+              <w:t>Drone vision service. Extracts embedded EXIF GPS tags for auto-panning and analyzes texture entropy for obstruction scoring.</w:t>
             </w:r>
           </w:p>
         </w:tc>
@@ -1552,7 +2037,7 @@
               <w:spacing w:after="40"/>
             </w:pPr>
             <w:r>
-              <w:t>Spatial raster heatmap scanner</w:t>
+              <w:t>Python, math</w:t>
             </w:r>
           </w:p>
         </w:tc>
@@ -1565,7 +2050,7 @@
               <w:spacing w:after="40"/>
             </w:pPr>
             <w:r>
-              <w:t>Generates a multi-point coordinate grid (3x3 to 9x9) across a 1-50 km radius to map regional Solar Hotspots and Wind Corridors.</w:t>
+              <w:t>Spatial scanner. Evaluates multi-point coordinate grids (3x3 to 9x9) across 1-50 km radius to map regional Solar Hotspots and Wind Corridors.</w:t>
             </w:r>
           </w:p>
         </w:tc>
@@ -1596,7 +2081,7 @@
               <w:spacing w:after="40"/>
             </w:pPr>
             <w:r>
-              <w:t>Runtime serialized datastore (CSV &amp; JSON)</w:t>
+              <w:t>CSV and JSON runtime files</w:t>
             </w:r>
           </w:p>
         </w:tc>
@@ -1609,7 +2094,7 @@
               <w:spacing w:after="40"/>
             </w:pPr>
             <w:r>
-              <w:t>Stores temporary session outputs: daily_weather.csv, hourly_wind.csv, monthly_summary.csv, resource_scores.json, energy_simulation.json, and final_recommendation.json.</w:t>
+              <w:t>Stores intermediate simulation outputs: daily_weather.csv, hourly_wind.csv, monthly_summary.csv, resource_scores.json, energy_simulation.json, techno_economics.json, final_recommendation.json.</w:t>
             </w:r>
           </w:p>
         </w:tc>
@@ -1640,7 +2125,7 @@
               <w:spacing w:after="40"/>
             </w:pPr>
             <w:r>
-              <w:t>Academic report repository</w:t>
+              <w:t>Markdown, PNG, JSON reports</w:t>
             </w:r>
           </w:p>
         </w:tc>
@@ -1653,7 +2138,7 @@
               <w:spacing w:after="40"/>
             </w:pPr>
             <w:r>
-              <w:t>Houses the master report, project audit, data quality audit, model metrics JSON, figures, and PowerShell terminal screenshots.</w:t>
+              <w:t>Houses master professor report, project audit, data quality report, model metrics JSON, figures, and PowerShell screenshots.</w:t>
             </w:r>
           </w:p>
         </w:tc>
@@ -1684,7 +2169,7 @@
               <w:spacing w:after="40"/>
             </w:pPr>
             <w:r>
-              <w:t>Independent data quality validator</w:t>
+              <w:t>Python, pandas, numpy</w:t>
             </w:r>
           </w:p>
         </w:tc>
@@ -1697,7 +2182,7 @@
               <w:spacing w:after="40"/>
             </w:pPr>
             <w:r>
-              <w:t>CLI script that checks meteorological datasets for missing values, NASA sentinels, physical bounds, and circular wind direction.</w:t>
+              <w:t>CLI data validator. Audits meteorological datasets for missing values, NASA sentinels, physical bounds, and circular wind direction.</w:t>
             </w:r>
           </w:p>
         </w:tc>
@@ -1728,7 +2213,7 @@
               <w:spacing w:after="40"/>
             </w:pPr>
             <w:r>
-              <w:t>ML evaluation and latency benchmark</w:t>
+              <w:t>Python, numpy, pandas</w:t>
             </w:r>
           </w:p>
         </w:tc>
@@ -1741,7 +2226,7 @@
               <w:spacing w:after="40"/>
             </w:pPr>
             <w:r>
-              <w:t>CLI script that trains the autoregressive Ridge forecasting model, compares against persistence baselines, and benchmarks execution latency.</w:t>
+              <w:t>CLI ML benchmark. Evaluates autoregressive Ridge forecasting model vs persistence baselines and profiles latency.</w:t>
             </w:r>
           </w:p>
         </w:tc>
@@ -1772,7 +2257,7 @@
               <w:spacing w:after="40"/>
             </w:pPr>
             <w:r>
-              <w:t>Automated Pytest test suite (78 tests)</w:t>
+              <w:t>Python, pytest, httpx</w:t>
             </w:r>
           </w:p>
         </w:tc>
@@ -1785,7 +2270,7 @@
               <w:spacing w:after="40"/>
             </w:pPr>
             <w:r>
-              <w:t>Verifies API contract shapes, Pydantic bounds, SQL/XSS injection rejection, and end-to-end solar/wind siting pipelines.</w:t>
+              <w:t>Automated test suite (78 tests). Verifies API contracts, Pydantic bounds, SQL/XSS injection rejection, and end-to-end user flows.</w:t>
             </w:r>
           </w:p>
         </w:tc>
@@ -1816,7 +2301,7 @@
               <w:spacing w:after="40"/>
             </w:pPr>
             <w:r>
-              <w:t>Operational &amp; command manual</w:t>
+              <w:t>Markdown documentation</w:t>
             </w:r>
           </w:p>
         </w:tc>
@@ -1829,7 +2314,7 @@
               <w:spacing w:after="40"/>
             </w:pPr>
             <w:r>
-              <w:t>Provides step-by-step PowerShell commands for environment setup, data validation, testing, and starting the server.</w:t>
+              <w:t>Operational manual with exact PowerShell commands for environment activation, data validation, testing, and starting Uvicorn.</w:t>
             </w:r>
           </w:p>
         </w:tc>
@@ -1849,14 +2334,14 @@
         <w:rPr>
           <w:b/>
           <w:color w:val="123456"/>
-          <w:sz w:val="36"/>
+          <w:sz w:val="34"/>
         </w:rPr>
-        <w:t>Section 8: Professor Viva Defense Strategy — Top 10 Questions &amp; Model Answers</w:t>
+        <w:t>Section 9: Top 10 Viva Questions &amp; High-Scoring Defense Answers</w:t>
       </w:r>
     </w:p>
     <w:p>
       <w:r>
-        <w:t>Here are the exact questions professors typically ask during renewable energy / AI project defenses, along with the precise, high-scoring answers your team should deliver:</w:t>
+        <w:t>Study these 10 authoritative questions and answers to defend your project with complete technical confidence:</w:t>
       </w:r>
     </w:p>
     <w:p>

</xml_diff>